<commit_message>
Avances hasta el marco Teorico
</commit_message>
<xml_diff>
--- a/CORRECCIONES TESIS AGOSTO 2026/LISTA DE CORRECCIONES R2.docx
+++ b/CORRECCIONES TESIS AGOSTO 2026/LISTA DE CORRECCIONES R2.docx
@@ -1093,174 +1093,170 @@
         <w:lastRenderedPageBreak/>
         <w:t xml:space="preserve">no se puedan visualizar. De </w:t>
       </w:r>
+      <w:r>
+        <w:rPr>
+          <w:lang w:val="es-MX"/>
+        </w:rPr>
+        <w:t>entrada,</w:t>
+      </w:r>
+      <w:r>
+        <w:rPr>
+          <w:lang w:val="es-MX"/>
+        </w:rPr>
+        <w:t xml:space="preserve"> sabemos que otros métodos (como </w:t>
+      </w:r>
+      <w:proofErr w:type="spellStart"/>
+      <w:r>
+        <w:rPr>
+          <w:lang w:val="es-MX"/>
+        </w:rPr>
+        <w:t>kernel</w:t>
+      </w:r>
+      <w:proofErr w:type="spellEnd"/>
+      <w:r>
+        <w:rPr>
+          <w:lang w:val="es-MX"/>
+        </w:rPr>
+        <w:t xml:space="preserve">) superarán en precisión al tuyo, entonces para que demostrar lo que ya </w:t>
+      </w:r>
       <w:proofErr w:type="gramStart"/>
       <w:r>
         <w:rPr>
           <w:lang w:val="es-MX"/>
         </w:rPr>
-        <w:t>entrada</w:t>
+        <w:t>sabemos?.</w:t>
       </w:r>
       <w:proofErr w:type="gramEnd"/>
       <w:r>
         <w:rPr>
           <w:lang w:val="es-MX"/>
         </w:rPr>
-        <w:t xml:space="preserve"> sabemos que otros métodos (como </w:t>
+        <w:t xml:space="preserve"> Considero que la comparación debe ser solo entre los que si permiten visualización.</w:t>
+      </w:r>
+    </w:p>
+    <w:p>
+      <w:pPr>
+        <w:rPr>
+          <w:lang w:val="es-MX"/>
+        </w:rPr>
+      </w:pPr>
+      <w:r>
+        <w:rPr>
+          <w:lang w:val="es-MX"/>
+        </w:rPr>
+        <w:t xml:space="preserve">En conclusión, salvo la mejor opinión de la Dra. Adriana, creo que la motivación de tu propuesta es la visualización (para casos no lineales), por lo </w:t>
+      </w:r>
+      <w:proofErr w:type="gramStart"/>
+      <w:r>
+        <w:rPr>
+          <w:lang w:val="es-MX"/>
+        </w:rPr>
+        <w:t>tanto</w:t>
+      </w:r>
+      <w:proofErr w:type="gramEnd"/>
+      <w:r>
+        <w:rPr>
+          <w:lang w:val="es-MX"/>
+        </w:rPr>
+        <w:t xml:space="preserve"> el objetivo, justificación, experimentos, resultados y discusión, deben estar alineados en congruencia con esto. De otra manera no queda claro lo que se quiere y por ende lo que se hizo para obtenerlo.</w:t>
+      </w:r>
+    </w:p>
+    <w:p>
+      <w:pPr>
+        <w:rPr>
+          <w:lang w:val="es-MX"/>
+        </w:rPr>
+      </w:pPr>
+      <w:r>
+        <w:rPr>
+          <w:lang w:val="es-MX"/>
+        </w:rPr>
+        <w:t>En la experimentación sugiero mostrar y discutir cada caso por separado, iniciando con los datos sintéticos (cebolla) para que sirvan de prueba de concepto, para posteriormente mostrar el desempeño en casos reales.</w:t>
+      </w:r>
+    </w:p>
+    <w:p>
+      <w:pPr>
+        <w:rPr>
+          <w:lang w:val="es-MX"/>
+        </w:rPr>
+      </w:pPr>
+    </w:p>
+    <w:p>
+      <w:pPr>
+        <w:rPr>
+          <w:lang w:val="es-MX"/>
+        </w:rPr>
+      </w:pPr>
+    </w:p>
+    <w:p>
+      <w:pPr>
+        <w:rPr>
+          <w:lang w:val="es-MX"/>
+        </w:rPr>
+      </w:pPr>
+    </w:p>
+    <w:p>
+      <w:pPr>
+        <w:rPr>
+          <w:lang w:val="es-MX"/>
+        </w:rPr>
+      </w:pPr>
+    </w:p>
+    <w:p>
+      <w:pPr>
+        <w:rPr>
+          <w:lang w:val="es-MX"/>
+        </w:rPr>
+      </w:pPr>
+      <w:r>
+        <w:rPr>
+          <w:lang w:val="es-MX"/>
+        </w:rPr>
+        <w:t>---------------------------------------------------------------------------------------------------</w:t>
+      </w:r>
+    </w:p>
+    <w:p>
+      <w:pPr>
+        <w:rPr>
+          <w:b/>
+          <w:bCs/>
+          <w:lang w:val="es-MX"/>
+        </w:rPr>
+      </w:pPr>
+      <w:r>
+        <w:rPr>
+          <w:b/>
+          <w:bCs/>
+          <w:lang w:val="es-MX"/>
+        </w:rPr>
+        <w:t xml:space="preserve">Comentarios directos al Documento por parte del </w:t>
       </w:r>
       <w:proofErr w:type="spellStart"/>
       <w:r>
         <w:rPr>
-          <w:lang w:val="es-MX"/>
-        </w:rPr>
-        <w:t>kernel</w:t>
+          <w:b/>
+          <w:bCs/>
+          <w:lang w:val="es-MX"/>
+        </w:rPr>
+        <w:t>Dr</w:t>
       </w:r>
       <w:proofErr w:type="spellEnd"/>
       <w:r>
         <w:rPr>
-          <w:lang w:val="es-MX"/>
-        </w:rPr>
-        <w:t xml:space="preserve">) superarán en precisión al tuyo, entonces para que demostrar lo que ya </w:t>
-      </w:r>
-      <w:proofErr w:type="gramStart"/>
-      <w:r>
-        <w:rPr>
-          <w:lang w:val="es-MX"/>
-        </w:rPr>
-        <w:t>sabemos?.</w:t>
-      </w:r>
-      <w:proofErr w:type="gramEnd"/>
-      <w:r>
-        <w:rPr>
-          <w:lang w:val="es-MX"/>
-        </w:rPr>
-        <w:t xml:space="preserve"> Considero que la comparación debe ser solo entre los que si permiten visualización.</w:t>
-      </w:r>
-    </w:p>
-    <w:p>
-      <w:pPr>
-        <w:rPr>
-          <w:lang w:val="es-MX"/>
-        </w:rPr>
-      </w:pPr>
-      <w:r>
-        <w:rPr>
-          <w:lang w:val="es-MX"/>
-        </w:rPr>
-        <w:t xml:space="preserve">En conclusión, salvo la mejor opinión de la Dra. Adriana, creo que la motivación de tu propuesta es la visualización (para casos no lineales), por lo </w:t>
-      </w:r>
-      <w:proofErr w:type="gramStart"/>
-      <w:r>
-        <w:rPr>
-          <w:lang w:val="es-MX"/>
-        </w:rPr>
-        <w:t>tanto</w:t>
-      </w:r>
-      <w:proofErr w:type="gramEnd"/>
-      <w:r>
-        <w:rPr>
-          <w:lang w:val="es-MX"/>
-        </w:rPr>
-        <w:t xml:space="preserve"> el objetivo, justificación, experimentos, resultados y discusión, deben estar alineados en congruencia con esto. De otra manera no queda claro lo que se quiere y por ende lo que se hizo para obtenerlo.</w:t>
-      </w:r>
-    </w:p>
-    <w:p>
-      <w:pPr>
-        <w:rPr>
-          <w:lang w:val="es-MX"/>
-        </w:rPr>
-      </w:pPr>
-      <w:r>
-        <w:rPr>
-          <w:lang w:val="es-MX"/>
-        </w:rPr>
-        <w:t>En la experimentación sugiero mostrar y discutir cada caso por separado, iniciando con los datos sintéticos (cebolla) para que sirvan de prueba de concepto, para posteriormente mostrar el desempeño en casos reales.</w:t>
-      </w:r>
-    </w:p>
-    <w:p>
-      <w:pPr>
-        <w:rPr>
-          <w:lang w:val="es-MX"/>
-        </w:rPr>
-      </w:pPr>
-    </w:p>
-    <w:p>
-      <w:pPr>
-        <w:rPr>
-          <w:lang w:val="es-MX"/>
-        </w:rPr>
-      </w:pPr>
-    </w:p>
-    <w:p>
-      <w:pPr>
-        <w:rPr>
-          <w:lang w:val="es-MX"/>
-        </w:rPr>
-      </w:pPr>
-    </w:p>
-    <w:p>
-      <w:pPr>
-        <w:rPr>
-          <w:lang w:val="es-MX"/>
-        </w:rPr>
-      </w:pPr>
-    </w:p>
-    <w:p>
-      <w:pPr>
-        <w:rPr>
-          <w:lang w:val="es-MX"/>
-        </w:rPr>
-      </w:pPr>
-      <w:r>
-        <w:rPr>
-          <w:lang w:val="es-MX"/>
-        </w:rPr>
-        <w:t>---------------------------------------------------------------------------------------------------</w:t>
-      </w:r>
-    </w:p>
-    <w:p>
-      <w:pPr>
-        <w:rPr>
-          <w:b/>
-          <w:bCs/>
-          <w:lang w:val="es-MX"/>
-        </w:rPr>
-      </w:pPr>
-      <w:r>
-        <w:rPr>
-          <w:b/>
-          <w:bCs/>
-          <w:lang w:val="es-MX"/>
-        </w:rPr>
-        <w:t xml:space="preserve">Comentarios directos al Documento por parte del </w:t>
-      </w:r>
-      <w:proofErr w:type="spellStart"/>
-      <w:r>
-        <w:rPr>
-          <w:b/>
-          <w:bCs/>
-          <w:lang w:val="es-MX"/>
-        </w:rPr>
-        <w:t>Dr</w:t>
-      </w:r>
-      <w:proofErr w:type="spellEnd"/>
-      <w:r>
-        <w:rPr>
           <w:b/>
           <w:bCs/>
           <w:lang w:val="es-MX"/>
         </w:rPr>
         <w:t xml:space="preserve"> </w:t>
       </w:r>
-      <w:proofErr w:type="spellStart"/>
-      <w:r>
-        <w:rPr>
-          <w:b/>
-          <w:bCs/>
-          <w:lang w:val="es-MX"/>
-        </w:rPr>
-        <w:t>Hector</w:t>
-      </w:r>
-      <w:proofErr w:type="spellEnd"/>
+      <w:r>
+        <w:rPr>
+          <w:b/>
+          <w:bCs/>
+          <w:lang w:val="es-MX"/>
+        </w:rPr>
+        <w:t>Héctor</w:t>
+      </w:r>
       <w:r>
         <w:rPr>
           <w:b/>
@@ -1375,17 +1371,15 @@
       <w:r>
         <w:br/>
       </w:r>
-      <w:proofErr w:type="spellStart"/>
-      <w:r>
-        <w:rPr>
-          <w:b/>
-          <w:bCs/>
-          <w:i/>
-          <w:iCs/>
-        </w:rPr>
-        <w:t>Capitulo</w:t>
-      </w:r>
-      <w:proofErr w:type="spellEnd"/>
+      <w:r>
+        <w:rPr>
+          <w:b/>
+          <w:bCs/>
+          <w:i/>
+          <w:iCs/>
+        </w:rPr>
+        <w:t>Capítulo</w:t>
+      </w:r>
       <w:r>
         <w:rPr>
           <w:b/>
@@ -1437,83 +1431,79 @@
           <w:iCs/>
         </w:rPr>
       </w:pPr>
+      <w:r>
+        <w:rPr>
+          <w:b/>
+          <w:bCs/>
+          <w:i/>
+          <w:iCs/>
+        </w:rPr>
+        <w:t>Capítulo</w:t>
+      </w:r>
+      <w:r>
+        <w:rPr>
+          <w:b/>
+          <w:bCs/>
+          <w:i/>
+          <w:iCs/>
+        </w:rPr>
+        <w:t xml:space="preserve"> 1: </w:t>
+      </w:r>
+      <w:r>
+        <w:rPr>
+          <w:b/>
+          <w:bCs/>
+          <w:i/>
+          <w:iCs/>
+        </w:rPr>
+        <w:t>Redacción del planteamiento del problema</w:t>
+      </w:r>
+    </w:p>
+    <w:p/>
+    <w:p>
+      <w:r>
+        <w:t>6.- Hacer primero la propuesta Y LUEGO, la justificación. Capitulo 1. Justificación.</w:t>
+      </w:r>
+    </w:p>
+    <w:p>
+      <w:r>
+        <w:rPr>
+          <w:b/>
+          <w:bCs/>
+          <w:i/>
+          <w:iCs/>
+        </w:rPr>
+        <w:t>Capítulo</w:t>
+      </w:r>
+      <w:r>
+        <w:rPr>
+          <w:b/>
+          <w:bCs/>
+          <w:i/>
+          <w:iCs/>
+        </w:rPr>
+        <w:t xml:space="preserve"> 1: </w:t>
+      </w:r>
+      <w:r>
+        <w:rPr>
+          <w:b/>
+          <w:bCs/>
+          <w:i/>
+          <w:iCs/>
+        </w:rPr>
+        <w:t>Hacer primero la propuesta Y LUEGO la justificación</w:t>
+      </w:r>
+    </w:p>
+    <w:p>
+      <w:r>
+        <w:t xml:space="preserve">7.- </w:t>
+      </w:r>
       <w:proofErr w:type="spellStart"/>
       <w:r>
-        <w:rPr>
-          <w:b/>
-          <w:bCs/>
-          <w:i/>
-          <w:iCs/>
-        </w:rPr>
-        <w:t>Capitulo</w:t>
+        <w:t>wrapper</w:t>
       </w:r>
       <w:proofErr w:type="spellEnd"/>
       <w:r>
-        <w:rPr>
-          <w:b/>
-          <w:bCs/>
-          <w:i/>
-          <w:iCs/>
-        </w:rPr>
-        <w:t xml:space="preserve"> 1: </w:t>
-      </w:r>
-      <w:r>
-        <w:rPr>
-          <w:b/>
-          <w:bCs/>
-          <w:i/>
-          <w:iCs/>
-        </w:rPr>
-        <w:t>Redacción del planteamiento del problema</w:t>
-      </w:r>
-    </w:p>
-    <w:p/>
-    <w:p>
-      <w:r>
-        <w:t>6.- Hacer primero la propuesta Y LUEGO, la justificación. Capitulo 1. Justificación.</w:t>
-      </w:r>
-    </w:p>
-    <w:p>
-      <w:proofErr w:type="spellStart"/>
-      <w:r>
-        <w:rPr>
-          <w:b/>
-          <w:bCs/>
-          <w:i/>
-          <w:iCs/>
-        </w:rPr>
-        <w:t>Capitulo</w:t>
-      </w:r>
-      <w:proofErr w:type="spellEnd"/>
-      <w:r>
-        <w:rPr>
-          <w:b/>
-          <w:bCs/>
-          <w:i/>
-          <w:iCs/>
-        </w:rPr>
-        <w:t xml:space="preserve"> 1: </w:t>
-      </w:r>
-      <w:r>
-        <w:rPr>
-          <w:b/>
-          <w:bCs/>
-          <w:i/>
-          <w:iCs/>
-        </w:rPr>
-        <w:t>Hacer primero la propuesta Y LUEGO la justificación</w:t>
-      </w:r>
-    </w:p>
-    <w:p>
-      <w:r>
-        <w:t xml:space="preserve">7.- </w:t>
-      </w:r>
-      <w:proofErr w:type="spellStart"/>
-      <w:r>
-        <w:t>wrapper</w:t>
-      </w:r>
-      <w:proofErr w:type="spellEnd"/>
-      <w:r>
         <w:t xml:space="preserve"> (Evitar la mezcla de idiomas o usar la traducción y las correspondientes cursivas). Capítulo 1. </w:t>
       </w:r>
       <w:proofErr w:type="gramStart"/>
@@ -1549,25 +1539,7 @@
           <w:i/>
           <w:iCs/>
         </w:rPr>
-        <w:t>Capítulo</w:t>
-      </w:r>
-      <w:r>
-        <w:rPr>
-          <w:b/>
-          <w:bCs/>
-          <w:i/>
-          <w:iCs/>
-        </w:rPr>
-        <w:t xml:space="preserve"> 1:</w:t>
-      </w:r>
-      <w:r>
-        <w:rPr>
-          <w:b/>
-          <w:bCs/>
-          <w:i/>
-          <w:iCs/>
-        </w:rPr>
-        <w:t xml:space="preserve"> Ajustar la hipótesis para que vaya acorde con la visualización y la interpretabilidad</w:t>
+        <w:t>Capítulo 1: Ajustar la hipótesis para que vaya acorde con la visualización y la interpretabilidad</w:t>
       </w:r>
     </w:p>
     <w:p/>
@@ -1938,7 +1910,27 @@
           <w:i/>
           <w:iCs/>
         </w:rPr>
-        <w:t xml:space="preserve"> 3: Decidir que y como incorporar la visualización y en que sección.</w:t>
+        <w:t xml:space="preserve"> 3: Decidir </w:t>
+      </w:r>
+      <w:proofErr w:type="spellStart"/>
+      <w:r>
+        <w:rPr>
+          <w:b/>
+          <w:bCs/>
+          <w:i/>
+          <w:iCs/>
+        </w:rPr>
+        <w:t>que</w:t>
+      </w:r>
+      <w:proofErr w:type="spellEnd"/>
+      <w:r>
+        <w:rPr>
+          <w:b/>
+          <w:bCs/>
+          <w:i/>
+          <w:iCs/>
+        </w:rPr>
+        <w:t xml:space="preserve"> y como incorporar la visualización y en que sección.</w:t>
       </w:r>
     </w:p>
     <w:p/>
@@ -2008,16 +2000,7 @@
           <w:i/>
           <w:iCs/>
         </w:rPr>
-        <w:t>Capítulo</w:t>
-      </w:r>
-      <w:r>
-        <w:rPr>
-          <w:b/>
-          <w:bCs/>
-          <w:i/>
-          <w:iCs/>
-        </w:rPr>
-        <w:t xml:space="preserve"> </w:t>
+        <w:t xml:space="preserve">Capítulo </w:t>
       </w:r>
       <w:r>
         <w:rPr>
@@ -2232,25 +2215,7 @@
           <w:i/>
           <w:iCs/>
         </w:rPr>
-        <w:t>Capítulo</w:t>
-      </w:r>
-      <w:r>
-        <w:rPr>
-          <w:b/>
-          <w:bCs/>
-          <w:i/>
-          <w:iCs/>
-        </w:rPr>
-        <w:t xml:space="preserve"> 6: capacidad predictiva, interpretabilidad y representación geométrica de los datos. (¿Como se miden estas características? ¿Porque son importantes?)</w:t>
-      </w:r>
-      <w:r>
-        <w:rPr>
-          <w:b/>
-          <w:bCs/>
-          <w:i/>
-          <w:iCs/>
-        </w:rPr>
-        <w:t>.</w:t>
+        <w:t>Capítulo 6: capacidad predictiva, interpretabilidad y representación geométrica de los datos. (¿Como se miden estas características? ¿Porque son importantes?).</w:t>
       </w:r>
     </w:p>
     <w:p>
@@ -2329,16 +2294,7 @@
           <w:i/>
           <w:iCs/>
         </w:rPr>
-        <w:t>¿</w:t>
-      </w:r>
-      <w:r>
-        <w:rPr>
-          <w:b/>
-          <w:bCs/>
-          <w:i/>
-          <w:iCs/>
-        </w:rPr>
-        <w:t>Si no se busca competir, entonces para que se hizo todo el trabajo?</w:t>
+        <w:t>¿Si no se busca competir, entonces para que se hizo todo el trabajo?</w:t>
       </w:r>
       <w:r>
         <w:br/>

</xml_diff>